<commit_message>
Align docs with current Stage B role and runtime status
</commit_message>
<xml_diff>
--- a/output/doc/自立科研项目进度情况统计表_填写版.docx
+++ b/output/doc/自立科研项目进度情况统计表_填写版.docx
@@ -26,13 +26,13 @@
         <w:tblLook w:val="04A0" w:firstRow="1" w:lastRow="0" w:firstColumn="1" w:lastColumn="0" w:noHBand="0" w:noVBand="1"/>
       </w:tblPr>
       <w:tblGrid>
-        <w:gridCol w:w="525"/>
-        <w:gridCol w:w="1397"/>
-        <w:gridCol w:w="3359"/>
-        <w:gridCol w:w="1746"/>
-        <w:gridCol w:w="2740"/>
-        <w:gridCol w:w="3471"/>
-        <w:gridCol w:w="1458"/>
+        <w:gridCol w:w="526"/>
+        <w:gridCol w:w="1408"/>
+        <w:gridCol w:w="3309"/>
+        <w:gridCol w:w="1758"/>
+        <w:gridCol w:w="2755"/>
+        <w:gridCol w:w="3473"/>
+        <w:gridCol w:w="1467"/>
       </w:tblGrid>
       <w:tr>
         <w:trPr>
@@ -245,7 +245,7 @@
               <w:rPr>
                 <w:sz w:val="20"/>
               </w:rPr>
-              <w:t>2. 建设formal/blind/challenge/holdout2数据集、标注指南和评测协议，验证系统稳定性、可控性与可解释性。</w:t>
+              <w:t>2. 建设formal/blind/challenge/holdout数据集、标注指南和评测协议，验证系统稳定性、可控性与可解释性。</w:t>
             </w:r>
           </w:p>
           <w:p>
@@ -299,19 +299,31 @@
             </w:r>
           </w:p>
           <w:p>
+            <w:pPr>
+              <w:rPr>
+                <w:rFonts w:hint="eastAsia"/>
+                <w:lang w:eastAsia="zh-CN"/>
+              </w:rPr>
+            </w:pPr>
             <w:r>
               <w:rPr>
                 <w:sz w:val="20"/>
               </w:rPr>
-              <w:t>4. 完成1次对内成果展示/演示。</w:t>
+              <w:t>4. 完成1次</w:t>
             </w:r>
-          </w:p>
-          <w:p>
+            <w:r>
+              <w:rPr>
+                <w:rFonts w:hint="eastAsia"/>
+                <w:sz w:val="20"/>
+                <w:lang w:eastAsia="zh-CN"/>
+              </w:rPr>
+              <w:t>阶段性</w:t>
+            </w:r>
             <w:r>
               <w:rPr>
                 <w:sz w:val="20"/>
               </w:rPr>
-              <w:t>5. 配套形成数据集、标注指南和复现实验结果。</w:t>
+              <w:t>演示。</w:t>
             </w:r>
           </w:p>
         </w:tc>
@@ -343,6 +355,13 @@
             </w:r>
           </w:p>
           <w:p>
+            <w:pPr>
+              <w:rPr>
+                <w:rFonts w:hint="eastAsia"/>
+                <w:sz w:val="20"/>
+                <w:lang w:eastAsia="zh-CN"/>
+              </w:rPr>
+            </w:pPr>
             <w:r>
               <w:rPr>
                 <w:sz w:val="20"/>
@@ -381,6 +400,7 @@
           <w:p>
             <w:pPr>
               <w:rPr>
+                <w:sz w:val="20"/>
                 <w:lang w:eastAsia="zh-CN"/>
               </w:rPr>
             </w:pPr>
@@ -390,6 +410,22 @@
                 <w:lang w:eastAsia="zh-CN"/>
               </w:rPr>
               <w:t>4. 已形成论文蓝图、专利蓝图、答辩 PPT 提纲和 Demo runbook，正在收口研究报告、专利文本和演示材料。</w:t>
+            </w:r>
+          </w:p>
+          <w:p>
+            <w:pPr>
+              <w:rPr>
+                <w:rFonts w:hint="eastAsia"/>
+                <w:lang w:eastAsia="zh-CN"/>
+              </w:rPr>
+            </w:pPr>
+            <w:r>
+              <w:rPr>
+                <w:rFonts w:hint="eastAsia"/>
+                <w:sz w:val="20"/>
+                <w:lang w:eastAsia="zh-CN"/>
+              </w:rPr>
+              <w:t>5. 已在黑客松等场景进行相关阶段性汇报演示。</w:t>
             </w:r>
           </w:p>
         </w:tc>
@@ -435,17 +471,49 @@
             <w:vAlign w:val="center"/>
           </w:tcPr>
           <w:p>
+            <w:pPr>
+              <w:rPr>
+                <w:lang w:eastAsia="zh-CN"/>
+              </w:rPr>
+            </w:pPr>
             <w:r>
               <w:rPr>
                 <w:sz w:val="20"/>
               </w:rPr>
-              <w:t>当前总体进度约80%。原型、数据和核心实验已基本完成，正在完成专利文本、研究报告和演示材料定稿，预计于2026年4月30日前完成项目验收准备工作。</w:t>
+              <w:t>当前总体进度约</w:t>
+            </w:r>
+            <w:r>
+              <w:rPr>
+                <w:rFonts w:hint="eastAsia"/>
+                <w:sz w:val="20"/>
+                <w:lang w:eastAsia="zh-CN"/>
+              </w:rPr>
+              <w:t>75</w:t>
+            </w:r>
+            <w:r>
+              <w:rPr>
+                <w:sz w:val="20"/>
+              </w:rPr>
+              <w:t>%。</w:t>
+            </w:r>
+            <w:r>
+              <w:rPr>
+                <w:sz w:val="20"/>
+                <w:lang w:eastAsia="zh-CN"/>
+              </w:rPr>
+              <w:t>原型、数据和核心实验已基本完成，正在完成专利文本、研究报告和演示材料定稿，预计于2026年4月30日前完成项目验收准备工作。</w:t>
             </w:r>
           </w:p>
         </w:tc>
       </w:tr>
     </w:tbl>
-    <w:p/>
+    <w:p>
+      <w:pPr>
+        <w:rPr>
+          <w:lang w:eastAsia="zh-CN"/>
+        </w:rPr>
+      </w:pPr>
+    </w:p>
     <w:sectPr>
       <w:pgSz w:w="15840" w:h="12240" w:orient="landscape"/>
       <w:pgMar w:top="737" w:right="680" w:bottom="737" w:left="680" w:header="720" w:footer="720" w:gutter="0"/>

</xml_diff>